<commit_message>
Sua tieu de truong, bo duong ke, bo cuc lai class diagram va ERD, them file Word tong ket
</commit_message>
<xml_diff>
--- a/LAB5/bao_cao/LAB5_Bai_6_Quan_ly_cong_ty_du_lich.docx
+++ b/LAB5/bao_cao/LAB5_Bai_6_Quan_ly_cong_ty_du_lich.docx
@@ -13,7 +13,7 @@
           <w:sz w:val="22"/>
           <w:szCs w:val="22"/>
         </w:rPr>
-        <w:t>ĐẠI HỌC CÔNG NGHỆ TP.HCM (HUTECH)</w:t>
+        <w:t>TRƯỜNG ĐẠI HỌC TÀI NGUYÊN VÀ MÔI TRƯỜNG TP. HỒ CHÍ MINH</w:t>
       </w:r>
     </w:p>
     <w:p>
@@ -79,9 +79,6 @@
     </w:p>
     <w:p>
       <w:pPr>
-        <w:pBdr>
-          <w:bottom w:val="single" w:sz="6" w:space="1" w:color="999999"/>
-        </w:pBdr>
         <w:spacing w:before="60" w:after="180"/>
       </w:pPr>
     </w:p>
@@ -4155,7 +4152,7 @@
       <w:r>
         <w:drawing>
           <wp:inline xmlns:a="http://schemas.openxmlformats.org/drawingml/2006/main" xmlns:pic="http://schemas.openxmlformats.org/drawingml/2006/picture">
-            <wp:extent cx="6300000" cy="5962769"/>
+            <wp:extent cx="6300000" cy="4181393"/>
             <wp:docPr id="1" name="Picture 1"/>
             <wp:cNvGraphicFramePr>
               <a:graphicFrameLocks noChangeAspect="1"/>
@@ -4176,7 +4173,7 @@
                   <pic:spPr>
                     <a:xfrm>
                       <a:off x="0" y="0"/>
-                      <a:ext cx="6300000" cy="5962769"/>
+                      <a:ext cx="6300000" cy="4181393"/>
                     </a:xfrm>
                     <a:prstGeom prst="rect"/>
                   </pic:spPr>

</xml_diff>